<commit_message>
feat: enhance variance reporting and template context; add dynamic month handling and update narrative summaries
</commit_message>
<xml_diff>
--- a/server/mpatemplate.docx
+++ b/server/mpatemplate.docx
@@ -477,52 +477,7 @@
         </w:rPr>
       </w:pPr>
       <w:r>
-        <w:rPr>
-          <w:lang w:val="en-GB"/>
-        </w:rPr>
-        <w:t xml:space="preserve">Highest branch is </w:t>
-      </w:r>
-      <w:r>
-        <w:rPr>
-          <w:lang w:val="en-US"/>
-        </w:rPr>
-        <w:t>{{PBT_branch_high}} branch and contributed {{PBT_branch_high_perc}}</w:t>
-      </w:r>
-      <w:r>
-        <w:rPr>
-          <w:lang w:val="en-GB"/>
-        </w:rPr>
-        <w:t>%</w:t>
-      </w:r>
-      <w:r>
-        <w:rPr>
-          <w:lang w:val="en-US"/>
-        </w:rPr>
-        <w:t xml:space="preserve"> with a</w:t>
-      </w:r>
-      <w:r>
-        <w:rPr>
-          <w:lang w:val="en-US"/>
-        </w:rPr>
-        <w:t xml:space="preserve"> MOM</w:t>
-      </w:r>
-      <w:r>
-        <w:rPr>
-          <w:lang w:val="en-US"/>
-        </w:rPr>
-        <w:t xml:space="preserve"> variance of </w:t>
-      </w:r>
-      <w:r>
-        <w:rPr>
-          <w:lang w:val="en-US"/>
-        </w:rPr>
-        <w:t>₦</w:t>
-      </w:r>
-      <w:r>
-        <w:rPr>
-          <w:lang w:val="en-US"/>
-        </w:rPr>
-        <w:t>{{PBT_branch_high_var}}.</w:t>
+        <w:t>Highest branch is {{PBT_branch_high}} branch and contributed {{PBT_branch_high_perc}}% with a {{PBT_branch_high_var_label}} of {{PBT_branch_high_var}}.</w:t>
       </w:r>
     </w:p>
     <w:p>
@@ -538,46 +493,7 @@
         </w:rPr>
       </w:pPr>
       <w:r>
-        <w:rPr>
-          <w:lang w:val="en-US"/>
-        </w:rPr>
-        <w:t>Lowest branch is {{PBT_branch_low}} branch and contributed {{PBT_branch_low_perc}}</w:t>
-      </w:r>
-      <w:r>
-        <w:rPr>
-          <w:lang w:val="en-GB"/>
-        </w:rPr>
-        <w:t>%</w:t>
-      </w:r>
-      <w:r>
-        <w:rPr>
-          <w:lang w:val="en-US"/>
-        </w:rPr>
-        <w:t xml:space="preserve"> with a </w:t>
-      </w:r>
-      <w:r>
-        <w:rPr>
-          <w:lang w:val="en-US"/>
-        </w:rPr>
-        <w:t xml:space="preserve">MOM </w:t>
-      </w:r>
-      <w:r>
-        <w:rPr>
-          <w:lang w:val="en-US"/>
-        </w:rPr>
-        <w:t xml:space="preserve">variance of </w:t>
-      </w:r>
-      <w:r>
-        <w:rPr>
-          <w:lang w:val="en-US"/>
-        </w:rPr>
-        <w:t>₦</w:t>
-      </w:r>
-      <w:r>
-        <w:rPr>
-          <w:lang w:val="en-US"/>
-        </w:rPr>
-        <w:t>{{PBT_branch_low_var}}.</w:t>
+        <w:t>Lowest branch is {{PBT_branch_low}} branch and contributed {{PBT_branch_low_perc}}% with a {{PBT_branch_low_var_label}} of {{PBT_branch_low_var}}.</w:t>
       </w:r>
     </w:p>
     <w:p>
@@ -793,21 +709,8 @@
             <w:vAlign w:val="bottom"/>
           </w:tcPr>
           <w:p>
-            <w:pPr>
-              <w:jc w:val="both"/>
-              <w:rPr>
-                <w:sz w:val="22"/>
-                <w:szCs w:val="22"/>
-                <w:lang w:val="en-GB"/>
-              </w:rPr>
-            </w:pPr>
-            <w:r>
-              <w:rPr>
-                <w:sz w:val="22"/>
-                <w:szCs w:val="22"/>
-                <w:lang w:val="en-GB"/>
-              </w:rPr>
-              <w:t>OCTOBER</w:t>
+            <w:r>
+              <w:t>{{period_month_1}}</w:t>
             </w:r>
           </w:p>
         </w:tc>
@@ -817,21 +720,8 @@
             <w:vAlign w:val="bottom"/>
           </w:tcPr>
           <w:p>
-            <w:pPr>
-              <w:jc w:val="both"/>
-              <w:rPr>
-                <w:sz w:val="22"/>
-                <w:szCs w:val="22"/>
-                <w:lang w:val="en-GB"/>
-              </w:rPr>
-            </w:pPr>
-            <w:r>
-              <w:rPr>
-                <w:sz w:val="22"/>
-                <w:szCs w:val="22"/>
-                <w:lang w:val="en-GB"/>
-              </w:rPr>
-              <w:t>NOVEMBER</w:t>
+            <w:r>
+              <w:t>{{period_month_2}}</w:t>
             </w:r>
           </w:p>
         </w:tc>
@@ -841,21 +731,8 @@
             <w:vAlign w:val="bottom"/>
           </w:tcPr>
           <w:p>
-            <w:pPr>
-              <w:jc w:val="both"/>
-              <w:rPr>
-                <w:sz w:val="22"/>
-                <w:szCs w:val="22"/>
-                <w:lang w:val="en-GB"/>
-              </w:rPr>
-            </w:pPr>
-            <w:r>
-              <w:rPr>
-                <w:sz w:val="22"/>
-                <w:szCs w:val="22"/>
-                <w:lang w:val="en-GB"/>
-              </w:rPr>
-              <w:t>DECEMBER</w:t>
+            <w:r>
+              <w:t>{{period_month_3}}</w:t>
             </w:r>
           </w:p>
         </w:tc>
@@ -1114,52 +991,7 @@
         </w:rPr>
       </w:pPr>
       <w:r>
-        <w:rPr>
-          <w:lang w:val="en-GB"/>
-        </w:rPr>
-        <w:t xml:space="preserve">Highest branch is </w:t>
-      </w:r>
-      <w:r>
-        <w:rPr>
-          <w:lang w:val="en-US"/>
-        </w:rPr>
-        <w:t>{{DDA_branch_high}} branch and contributed {{DDA_branch_high_perc}}</w:t>
-      </w:r>
-      <w:r>
-        <w:rPr>
-          <w:lang w:val="en-GB"/>
-        </w:rPr>
-        <w:t>%</w:t>
-      </w:r>
-      <w:r>
-        <w:rPr>
-          <w:lang w:val="en-US"/>
-        </w:rPr>
-        <w:t xml:space="preserve"> with a </w:t>
-      </w:r>
-      <w:r>
-        <w:rPr>
-          <w:lang w:val="en-US"/>
-        </w:rPr>
-        <w:t>MOM variance</w:t>
-      </w:r>
-      <w:r>
-        <w:rPr>
-          <w:lang w:val="en-US"/>
-        </w:rPr>
-        <w:t xml:space="preserve"> of </w:t>
-      </w:r>
-      <w:r>
-        <w:rPr>
-          <w:lang w:val="en-US"/>
-        </w:rPr>
-        <w:t>₦</w:t>
-      </w:r>
-      <w:r>
-        <w:rPr>
-          <w:lang w:val="en-US"/>
-        </w:rPr>
-        <w:t>{{DDA_branch_high_var}}.</w:t>
+        <w:t>Highest branch is {{DDA_branch_high}} branch and contributed {{DDA_branch_high_perc}}% with a {{DDA_branch_high_var_label}} of {{DDA_branch_high_var}}.</w:t>
       </w:r>
     </w:p>
     <w:p>
@@ -1175,46 +1007,7 @@
         </w:rPr>
       </w:pPr>
       <w:r>
-        <w:rPr>
-          <w:lang w:val="en-US"/>
-        </w:rPr>
-        <w:t>Lowest branch is {{DDA_branch_low}} branch and contributed {{DDA_branch_low_perc}}</w:t>
-      </w:r>
-      <w:r>
-        <w:rPr>
-          <w:lang w:val="en-GB"/>
-        </w:rPr>
-        <w:t>%</w:t>
-      </w:r>
-      <w:r>
-        <w:rPr>
-          <w:lang w:val="en-US"/>
-        </w:rPr>
-        <w:t xml:space="preserve"> with a </w:t>
-      </w:r>
-      <w:r>
-        <w:rPr>
-          <w:lang w:val="en-US"/>
-        </w:rPr>
-        <w:t xml:space="preserve">MOM variance </w:t>
-      </w:r>
-      <w:r>
-        <w:rPr>
-          <w:lang w:val="en-US"/>
-        </w:rPr>
-        <w:t xml:space="preserve">of </w:t>
-      </w:r>
-      <w:r>
-        <w:rPr>
-          <w:lang w:val="en-US"/>
-        </w:rPr>
-        <w:t>₦</w:t>
-      </w:r>
-      <w:r>
-        <w:rPr>
-          <w:lang w:val="en-US"/>
-        </w:rPr>
-        <w:t>{{DDA_branch_low_var}}.</w:t>
+        <w:t>Lowest branch is {{DDA_branch_low}} branch and contributed {{DDA_branch_low_perc}}% with a {{DDA_branch_low_var_label}} of {{DDA_branch_low_var}}.</w:t>
       </w:r>
     </w:p>
     <w:p>
@@ -1256,21 +1049,8 @@
             <w:vAlign w:val="bottom"/>
           </w:tcPr>
           <w:p>
-            <w:pPr>
-              <w:jc w:val="both"/>
-              <w:rPr>
-                <w:sz w:val="22"/>
-                <w:szCs w:val="22"/>
-                <w:lang w:val="en-GB"/>
-              </w:rPr>
-            </w:pPr>
-            <w:r>
-              <w:rPr>
-                <w:sz w:val="22"/>
-                <w:szCs w:val="22"/>
-                <w:lang w:val="en-GB"/>
-              </w:rPr>
-              <w:t>OCTOBER</w:t>
+            <w:r>
+              <w:t>{{period_month_1}}</w:t>
             </w:r>
           </w:p>
         </w:tc>
@@ -1280,21 +1060,8 @@
             <w:vAlign w:val="bottom"/>
           </w:tcPr>
           <w:p>
-            <w:pPr>
-              <w:jc w:val="both"/>
-              <w:rPr>
-                <w:sz w:val="22"/>
-                <w:szCs w:val="22"/>
-                <w:lang w:val="en-GB"/>
-              </w:rPr>
-            </w:pPr>
-            <w:r>
-              <w:rPr>
-                <w:sz w:val="22"/>
-                <w:szCs w:val="22"/>
-                <w:lang w:val="en-GB"/>
-              </w:rPr>
-              <w:t>NOVEMBER</w:t>
+            <w:r>
+              <w:t>{{period_month_2}}</w:t>
             </w:r>
           </w:p>
         </w:tc>
@@ -1304,21 +1071,8 @@
             <w:vAlign w:val="bottom"/>
           </w:tcPr>
           <w:p>
-            <w:pPr>
-              <w:jc w:val="both"/>
-              <w:rPr>
-                <w:sz w:val="22"/>
-                <w:szCs w:val="22"/>
-                <w:lang w:val="en-GB"/>
-              </w:rPr>
-            </w:pPr>
-            <w:r>
-              <w:rPr>
-                <w:sz w:val="22"/>
-                <w:szCs w:val="22"/>
-                <w:lang w:val="en-GB"/>
-              </w:rPr>
-              <w:t>DECEMBER</w:t>
+            <w:r>
+              <w:t>{{period_month_3}}</w:t>
             </w:r>
           </w:p>
         </w:tc>
@@ -1575,53 +1329,7 @@
         </w:rPr>
       </w:pPr>
       <w:r>
-        <w:rPr>
-          <w:lang w:val="en-GB"/>
-        </w:rPr>
-        <w:lastRenderedPageBreak/>
-        <w:t xml:space="preserve">Highest branch is </w:t>
-      </w:r>
-      <w:r>
-        <w:rPr>
-          <w:lang w:val="en-US"/>
-        </w:rPr>
-        <w:t>{{SAV_branch_high}} branch and contributed {{SAV_branch_high_perc}}</w:t>
-      </w:r>
-      <w:r>
-        <w:rPr>
-          <w:lang w:val="en-GB"/>
-        </w:rPr>
-        <w:t>%</w:t>
-      </w:r>
-      <w:r>
-        <w:rPr>
-          <w:lang w:val="en-US"/>
-        </w:rPr>
-        <w:t xml:space="preserve"> with a </w:t>
-      </w:r>
-      <w:r>
-        <w:rPr>
-          <w:lang w:val="en-US"/>
-        </w:rPr>
-        <w:t xml:space="preserve">MOM variance </w:t>
-      </w:r>
-      <w:r>
-        <w:rPr>
-          <w:lang w:val="en-US"/>
-        </w:rPr>
-        <w:t xml:space="preserve">of </w:t>
-      </w:r>
-      <w:r>
-        <w:rPr>
-          <w:lang w:val="en-US"/>
-        </w:rPr>
-        <w:t>₦</w:t>
-      </w:r>
-      <w:r>
-        <w:rPr>
-          <w:lang w:val="en-US"/>
-        </w:rPr>
-        <w:t>{{SAV_branch_high_var}}.</w:t>
+        <w:t>Highest branch is {{SAV_branch_high}} branch and contributed {{SAV_branch_high_perc}}% with a {{SAV_branch_high_var_label}} of {{SAV_branch_high_var}}.</w:t>
       </w:r>
     </w:p>
     <w:p>
@@ -1637,46 +1345,7 @@
         </w:rPr>
       </w:pPr>
       <w:r>
-        <w:rPr>
-          <w:lang w:val="en-US"/>
-        </w:rPr>
-        <w:t>Lowest branch is {{SAV_branch_low}} branch and contributed {{SAV_branch_low_perc}}</w:t>
-      </w:r>
-      <w:r>
-        <w:rPr>
-          <w:lang w:val="en-GB"/>
-        </w:rPr>
-        <w:t>%</w:t>
-      </w:r>
-      <w:r>
-        <w:rPr>
-          <w:lang w:val="en-US"/>
-        </w:rPr>
-        <w:t xml:space="preserve"> with a </w:t>
-      </w:r>
-      <w:r>
-        <w:rPr>
-          <w:lang w:val="en-US"/>
-        </w:rPr>
-        <w:t xml:space="preserve">MOM variance </w:t>
-      </w:r>
-      <w:r>
-        <w:rPr>
-          <w:lang w:val="en-US"/>
-        </w:rPr>
-        <w:t xml:space="preserve">of </w:t>
-      </w:r>
-      <w:r>
-        <w:rPr>
-          <w:lang w:val="en-US"/>
-        </w:rPr>
-        <w:t>₦</w:t>
-      </w:r>
-      <w:r>
-        <w:rPr>
-          <w:lang w:val="en-US"/>
-        </w:rPr>
-        <w:t>{{SAV_branch_low_var}}.</w:t>
+        <w:t>Lowest branch is {{SAV_branch_low}} branch and contributed {{SAV_branch_low_perc}}% with a {{SAV_branch_low_var_label}} of {{SAV_branch_low_var}}.</w:t>
       </w:r>
     </w:p>
     <w:p>
@@ -1718,21 +1387,8 @@
             <w:vAlign w:val="bottom"/>
           </w:tcPr>
           <w:p>
-            <w:pPr>
-              <w:jc w:val="both"/>
-              <w:rPr>
-                <w:sz w:val="22"/>
-                <w:szCs w:val="22"/>
-                <w:lang w:val="en-GB"/>
-              </w:rPr>
-            </w:pPr>
-            <w:r>
-              <w:rPr>
-                <w:sz w:val="22"/>
-                <w:szCs w:val="22"/>
-                <w:lang w:val="en-GB"/>
-              </w:rPr>
-              <w:t>OCTOBER</w:t>
+            <w:r>
+              <w:t>{{period_month_1}}</w:t>
             </w:r>
           </w:p>
         </w:tc>
@@ -1742,21 +1398,8 @@
             <w:vAlign w:val="bottom"/>
           </w:tcPr>
           <w:p>
-            <w:pPr>
-              <w:jc w:val="both"/>
-              <w:rPr>
-                <w:sz w:val="22"/>
-                <w:szCs w:val="22"/>
-                <w:lang w:val="en-GB"/>
-              </w:rPr>
-            </w:pPr>
-            <w:r>
-              <w:rPr>
-                <w:sz w:val="22"/>
-                <w:szCs w:val="22"/>
-                <w:lang w:val="en-GB"/>
-              </w:rPr>
-              <w:t>NOVEMBER</w:t>
+            <w:r>
+              <w:t>{{period_month_2}}</w:t>
             </w:r>
           </w:p>
         </w:tc>
@@ -1766,21 +1409,8 @@
             <w:vAlign w:val="bottom"/>
           </w:tcPr>
           <w:p>
-            <w:pPr>
-              <w:jc w:val="both"/>
-              <w:rPr>
-                <w:sz w:val="22"/>
-                <w:szCs w:val="22"/>
-                <w:lang w:val="en-GB"/>
-              </w:rPr>
-            </w:pPr>
-            <w:r>
-              <w:rPr>
-                <w:sz w:val="22"/>
-                <w:szCs w:val="22"/>
-                <w:lang w:val="en-GB"/>
-              </w:rPr>
-              <w:t>DECEMBER</w:t>
+            <w:r>
+              <w:t>{{period_month_3}}</w:t>
             </w:r>
           </w:p>
         </w:tc>
@@ -2008,52 +1638,7 @@
         </w:rPr>
       </w:pPr>
       <w:r>
-        <w:rPr>
-          <w:lang w:val="en-GB"/>
-        </w:rPr>
-        <w:t xml:space="preserve">Highest branch is </w:t>
-      </w:r>
-      <w:r>
-        <w:rPr>
-          <w:lang w:val="en-US"/>
-        </w:rPr>
-        <w:t>{{FD_branch_high}} branch and contributed {{FD_branch_high_perc}}</w:t>
-      </w:r>
-      <w:r>
-        <w:rPr>
-          <w:lang w:val="en-US"/>
-        </w:rPr>
-        <w:t>%</w:t>
-      </w:r>
-      <w:r>
-        <w:rPr>
-          <w:lang w:val="en-US"/>
-        </w:rPr>
-        <w:t xml:space="preserve"> with a </w:t>
-      </w:r>
-      <w:r>
-        <w:rPr>
-          <w:lang w:val="en-US"/>
-        </w:rPr>
-        <w:t xml:space="preserve">MOM variance </w:t>
-      </w:r>
-      <w:r>
-        <w:rPr>
-          <w:lang w:val="en-US"/>
-        </w:rPr>
-        <w:t xml:space="preserve">of </w:t>
-      </w:r>
-      <w:r>
-        <w:rPr>
-          <w:lang w:val="en-US"/>
-        </w:rPr>
-        <w:t>₦</w:t>
-      </w:r>
-      <w:r>
-        <w:rPr>
-          <w:lang w:val="en-US"/>
-        </w:rPr>
-        <w:t>{{FD_branch_high_var}}.</w:t>
+        <w:t>Highest branch is {{FD_branch_high}} branch and contributed {{FD_branch_high_perc}}% with a {{FD_branch_high_var_label}} of {{FD_branch_high_var}}.</w:t>
       </w:r>
     </w:p>
     <w:p>
@@ -2069,46 +1654,7 @@
         </w:rPr>
       </w:pPr>
       <w:r>
-        <w:rPr>
-          <w:lang w:val="en-US"/>
-        </w:rPr>
-        <w:t>Lowest branch is {{FD_branch_low}} branch and contributed {{FD_branch_low_perc}}</w:t>
-      </w:r>
-      <w:r>
-        <w:rPr>
-          <w:lang w:val="en-GB"/>
-        </w:rPr>
-        <w:t>%</w:t>
-      </w:r>
-      <w:r>
-        <w:rPr>
-          <w:lang w:val="en-US"/>
-        </w:rPr>
-        <w:t xml:space="preserve"> with a </w:t>
-      </w:r>
-      <w:r>
-        <w:rPr>
-          <w:lang w:val="en-US"/>
-        </w:rPr>
-        <w:t xml:space="preserve">MOM variance </w:t>
-      </w:r>
-      <w:r>
-        <w:rPr>
-          <w:lang w:val="en-US"/>
-        </w:rPr>
-        <w:t xml:space="preserve">of </w:t>
-      </w:r>
-      <w:r>
-        <w:rPr>
-          <w:lang w:val="en-US"/>
-        </w:rPr>
-        <w:t>₦</w:t>
-      </w:r>
-      <w:r>
-        <w:rPr>
-          <w:lang w:val="en-US"/>
-        </w:rPr>
-        <w:t>{{FD_branch_low_var}}.</w:t>
+        <w:t>Lowest branch is {{FD_branch_low}} branch and contributed {{FD_branch_low_perc}}% with a {{FD_branch_low_var_label}} of {{FD_branch_low_var}}.</w:t>
       </w:r>
     </w:p>
     <w:p>
@@ -2166,21 +1712,8 @@
             <w:vAlign w:val="bottom"/>
           </w:tcPr>
           <w:p>
-            <w:pPr>
-              <w:jc w:val="both"/>
-              <w:rPr>
-                <w:sz w:val="22"/>
-                <w:szCs w:val="22"/>
-                <w:lang w:val="en-GB"/>
-              </w:rPr>
-            </w:pPr>
-            <w:r>
-              <w:rPr>
-                <w:sz w:val="22"/>
-                <w:szCs w:val="22"/>
-                <w:lang w:val="en-GB"/>
-              </w:rPr>
-              <w:t>OCTOBER</w:t>
+            <w:r>
+              <w:t>{{period_month_1}}</w:t>
             </w:r>
           </w:p>
         </w:tc>
@@ -2190,21 +1723,8 @@
             <w:vAlign w:val="bottom"/>
           </w:tcPr>
           <w:p>
-            <w:pPr>
-              <w:jc w:val="both"/>
-              <w:rPr>
-                <w:sz w:val="22"/>
-                <w:szCs w:val="22"/>
-                <w:lang w:val="en-GB"/>
-              </w:rPr>
-            </w:pPr>
-            <w:r>
-              <w:rPr>
-                <w:sz w:val="22"/>
-                <w:szCs w:val="22"/>
-                <w:lang w:val="en-GB"/>
-              </w:rPr>
-              <w:t>NOVEMBER</w:t>
+            <w:r>
+              <w:t>{{period_month_2}}</w:t>
             </w:r>
           </w:p>
         </w:tc>
@@ -2214,21 +1734,8 @@
             <w:vAlign w:val="bottom"/>
           </w:tcPr>
           <w:p>
-            <w:pPr>
-              <w:jc w:val="both"/>
-              <w:rPr>
-                <w:sz w:val="22"/>
-                <w:szCs w:val="22"/>
-                <w:lang w:val="en-GB"/>
-              </w:rPr>
-            </w:pPr>
-            <w:r>
-              <w:rPr>
-                <w:sz w:val="22"/>
-                <w:szCs w:val="22"/>
-                <w:lang w:val="en-GB"/>
-              </w:rPr>
-              <w:t>DECEMBER</w:t>
+            <w:r>
+              <w:t>{{period_month_3}}</w:t>
             </w:r>
           </w:p>
         </w:tc>
@@ -2559,21 +2066,8 @@
             <w:vAlign w:val="bottom"/>
           </w:tcPr>
           <w:p>
-            <w:pPr>
-              <w:jc w:val="both"/>
-              <w:rPr>
-                <w:sz w:val="22"/>
-                <w:szCs w:val="22"/>
-                <w:lang w:val="en-GB"/>
-              </w:rPr>
-            </w:pPr>
-            <w:r>
-              <w:rPr>
-                <w:sz w:val="22"/>
-                <w:szCs w:val="22"/>
-                <w:lang w:val="en-GB"/>
-              </w:rPr>
-              <w:t>OCTOBER</w:t>
+            <w:r>
+              <w:t>{{period_month_1}}</w:t>
             </w:r>
           </w:p>
         </w:tc>
@@ -2583,21 +2077,8 @@
             <w:vAlign w:val="bottom"/>
           </w:tcPr>
           <w:p>
-            <w:pPr>
-              <w:jc w:val="both"/>
-              <w:rPr>
-                <w:sz w:val="22"/>
-                <w:szCs w:val="22"/>
-                <w:lang w:val="en-GB"/>
-              </w:rPr>
-            </w:pPr>
-            <w:r>
-              <w:rPr>
-                <w:sz w:val="22"/>
-                <w:szCs w:val="22"/>
-                <w:lang w:val="en-GB"/>
-              </w:rPr>
-              <w:t>NOVEMBER</w:t>
+            <w:r>
+              <w:t>{{period_month_2}}</w:t>
             </w:r>
           </w:p>
         </w:tc>
@@ -2607,21 +2088,8 @@
             <w:vAlign w:val="bottom"/>
           </w:tcPr>
           <w:p>
-            <w:pPr>
-              <w:jc w:val="both"/>
-              <w:rPr>
-                <w:sz w:val="22"/>
-                <w:szCs w:val="22"/>
-                <w:lang w:val="en-GB"/>
-              </w:rPr>
-            </w:pPr>
-            <w:r>
-              <w:rPr>
-                <w:sz w:val="22"/>
-                <w:szCs w:val="22"/>
-                <w:lang w:val="en-GB"/>
-              </w:rPr>
-              <w:t>DECEMBER</w:t>
+            <w:r>
+              <w:t>{{period_month_3}}</w:t>
             </w:r>
           </w:p>
         </w:tc>
@@ -2972,44 +2440,18 @@
             <w:tcW w:w="1731" w:type="dxa"/>
           </w:tcPr>
           <w:p>
-            <w:pPr>
-              <w:jc w:val="both"/>
-              <w:rPr>
-                <w:sz w:val="22"/>
-                <w:szCs w:val="22"/>
-                <w:lang w:val="en-GB"/>
-              </w:rPr>
-            </w:pPr>
-            <w:r>
-              <w:rPr>
-                <w:sz w:val="22"/>
-                <w:szCs w:val="22"/>
-                <w:lang w:val="en-GB"/>
-              </w:rPr>
-              <w:t>NOVEMBER</w:t>
-            </w:r>
-          </w:p>
-        </w:tc>
-        <w:tc>
-          <w:tcPr>
-            <w:tcW w:w="1731" w:type="dxa"/>
-          </w:tcPr>
-          <w:p>
-            <w:pPr>
-              <w:jc w:val="both"/>
-              <w:rPr>
-                <w:sz w:val="22"/>
-                <w:szCs w:val="22"/>
-                <w:lang w:val="en-GB"/>
-              </w:rPr>
-            </w:pPr>
-            <w:r>
-              <w:rPr>
-                <w:sz w:val="22"/>
-                <w:szCs w:val="22"/>
-                <w:lang w:val="en-GB"/>
-              </w:rPr>
-              <w:t>DECEMBER</w:t>
+            <w:r>
+              <w:t>{{period_month_2}}</w:t>
+            </w:r>
+          </w:p>
+        </w:tc>
+        <w:tc>
+          <w:tcPr>
+            <w:tcW w:w="1731" w:type="dxa"/>
+          </w:tcPr>
+          <w:p>
+            <w:r>
+              <w:t>{{period_month_3}}</w:t>
             </w:r>
           </w:p>
         </w:tc>
@@ -3148,12 +2590,7 @@
         </w:rPr>
       </w:pPr>
       <w:r>
-        <w:rPr>
-          <w:sz w:val="22"/>
-          <w:szCs w:val="22"/>
-          <w:lang w:val="en-GB"/>
-        </w:rPr>
-        <w:t>DECEMBER</w:t>
+        <w:t>{{report_month}}</w:t>
       </w:r>
     </w:p>
     <w:tbl>
@@ -3468,44 +2905,7 @@
         </w:rPr>
       </w:pPr>
       <w:r>
-        <w:rPr>
-          <w:sz w:val="22"/>
-          <w:szCs w:val="22"/>
-          <w:lang w:val="en-GB"/>
-        </w:rPr>
-        <w:t>CARDS (</w:t>
-      </w:r>
-      <w:r>
-        <w:rPr>
-          <w:sz w:val="22"/>
-          <w:szCs w:val="22"/>
-          <w:lang w:val="en-GB"/>
-        </w:rPr>
-        <w:t>NOVEMBER</w:t>
-      </w:r>
-      <w:r>
-        <w:rPr>
-          <w:sz w:val="22"/>
-          <w:szCs w:val="22"/>
-          <w:lang w:val="en-GB"/>
-        </w:rPr>
-        <w:t xml:space="preserve"> - </w:t>
-      </w:r>
-      <w:r>
-        <w:rPr>
-          <w:sz w:val="22"/>
-          <w:szCs w:val="22"/>
-          <w:lang w:val="en-GB"/>
-        </w:rPr>
-        <w:t>DECEMBER</w:t>
-      </w:r>
-      <w:r>
-        <w:rPr>
-          <w:sz w:val="22"/>
-          <w:szCs w:val="22"/>
-          <w:lang w:val="en-GB"/>
-        </w:rPr>
-        <w:t>)</w:t>
+        <w:t>CARDS ({{period_month_previous}} - {{period_month_current}})</w:t>
       </w:r>
     </w:p>
     <w:tbl>
@@ -3745,21 +3145,8 @@
             <w:vAlign w:val="bottom"/>
           </w:tcPr>
           <w:p>
-            <w:pPr>
-              <w:jc w:val="both"/>
-              <w:rPr>
-                <w:sz w:val="22"/>
-                <w:szCs w:val="22"/>
-                <w:lang w:val="en-GB"/>
-              </w:rPr>
-            </w:pPr>
-            <w:r>
-              <w:rPr>
-                <w:sz w:val="22"/>
-                <w:szCs w:val="22"/>
-                <w:lang w:val="en-GB"/>
-              </w:rPr>
-              <w:t>OCTOBER</w:t>
+            <w:r>
+              <w:t>{{period_month_1}}</w:t>
             </w:r>
           </w:p>
         </w:tc>
@@ -3769,21 +3156,8 @@
             <w:vAlign w:val="bottom"/>
           </w:tcPr>
           <w:p>
-            <w:pPr>
-              <w:jc w:val="both"/>
-              <w:rPr>
-                <w:sz w:val="22"/>
-                <w:szCs w:val="22"/>
-                <w:lang w:val="en-GB"/>
-              </w:rPr>
-            </w:pPr>
-            <w:r>
-              <w:rPr>
-                <w:sz w:val="22"/>
-                <w:szCs w:val="22"/>
-                <w:lang w:val="en-GB"/>
-              </w:rPr>
-              <w:t>NOVEMBER</w:t>
+            <w:r>
+              <w:t>{{period_month_2}}</w:t>
             </w:r>
           </w:p>
         </w:tc>
@@ -3793,21 +3167,8 @@
             <w:vAlign w:val="bottom"/>
           </w:tcPr>
           <w:p>
-            <w:pPr>
-              <w:jc w:val="both"/>
-              <w:rPr>
-                <w:sz w:val="22"/>
-                <w:szCs w:val="22"/>
-                <w:lang w:val="en-GB"/>
-              </w:rPr>
-            </w:pPr>
-            <w:r>
-              <w:rPr>
-                <w:sz w:val="22"/>
-                <w:szCs w:val="22"/>
-                <w:lang w:val="en-GB"/>
-              </w:rPr>
-              <w:t>DECEMBER</w:t>
+            <w:r>
+              <w:t>{{period_month_3}}</w:t>
             </w:r>
           </w:p>
         </w:tc>
@@ -3982,21 +3343,8 @@
             <w:vAlign w:val="bottom"/>
           </w:tcPr>
           <w:p>
-            <w:pPr>
-              <w:jc w:val="both"/>
-              <w:rPr>
-                <w:sz w:val="22"/>
-                <w:szCs w:val="22"/>
-                <w:lang w:val="en-GB"/>
-              </w:rPr>
-            </w:pPr>
-            <w:r>
-              <w:rPr>
-                <w:sz w:val="22"/>
-                <w:szCs w:val="22"/>
-                <w:lang w:val="en-GB"/>
-              </w:rPr>
-              <w:t>OCTOBER</w:t>
+            <w:r>
+              <w:t>{{period_month_1}}</w:t>
             </w:r>
           </w:p>
         </w:tc>
@@ -4006,21 +3354,8 @@
             <w:vAlign w:val="bottom"/>
           </w:tcPr>
           <w:p>
-            <w:pPr>
-              <w:jc w:val="both"/>
-              <w:rPr>
-                <w:sz w:val="22"/>
-                <w:szCs w:val="22"/>
-                <w:lang w:val="en-GB"/>
-              </w:rPr>
-            </w:pPr>
-            <w:r>
-              <w:rPr>
-                <w:sz w:val="22"/>
-                <w:szCs w:val="22"/>
-                <w:lang w:val="en-GB"/>
-              </w:rPr>
-              <w:t>NOVEMBER</w:t>
+            <w:r>
+              <w:t>{{period_month_2}}</w:t>
             </w:r>
           </w:p>
         </w:tc>
@@ -4030,21 +3365,8 @@
             <w:vAlign w:val="bottom"/>
           </w:tcPr>
           <w:p>
-            <w:pPr>
-              <w:jc w:val="both"/>
-              <w:rPr>
-                <w:sz w:val="22"/>
-                <w:szCs w:val="22"/>
-                <w:lang w:val="en-GB"/>
-              </w:rPr>
-            </w:pPr>
-            <w:r>
-              <w:rPr>
-                <w:sz w:val="22"/>
-                <w:szCs w:val="22"/>
-                <w:lang w:val="en-GB"/>
-              </w:rPr>
-              <w:t>DECEMBER</w:t>
+            <w:r>
+              <w:t>{{period_month_3}}</w:t>
             </w:r>
           </w:p>
         </w:tc>
@@ -4217,21 +3539,8 @@
             <w:tcW w:w="2120" w:type="dxa"/>
           </w:tcPr>
           <w:p>
-            <w:pPr>
-              <w:jc w:val="both"/>
-              <w:rPr>
-                <w:sz w:val="22"/>
-                <w:szCs w:val="22"/>
-                <w:lang w:val="en-GB"/>
-              </w:rPr>
-            </w:pPr>
-            <w:r>
-              <w:rPr>
-                <w:sz w:val="22"/>
-                <w:szCs w:val="22"/>
-                <w:lang w:val="en-GB"/>
-              </w:rPr>
-              <w:t>DECEMBER</w:t>
+            <w:r>
+              <w:t>{{period_month_3}}</w:t>
             </w:r>
           </w:p>
         </w:tc>
@@ -4865,21 +4174,8 @@
             <w:vAlign w:val="bottom"/>
           </w:tcPr>
           <w:p>
-            <w:pPr>
-              <w:jc w:val="both"/>
-              <w:rPr>
-                <w:sz w:val="22"/>
-                <w:szCs w:val="22"/>
-                <w:lang w:val="en-GB"/>
-              </w:rPr>
-            </w:pPr>
-            <w:r>
-              <w:rPr>
-                <w:sz w:val="22"/>
-                <w:szCs w:val="22"/>
-                <w:lang w:val="en-GB"/>
-              </w:rPr>
-              <w:t>OCTOBER</w:t>
+            <w:r>
+              <w:t>{{period_month_1}}</w:t>
             </w:r>
           </w:p>
         </w:tc>
@@ -4889,21 +4185,8 @@
             <w:vAlign w:val="bottom"/>
           </w:tcPr>
           <w:p>
-            <w:pPr>
-              <w:jc w:val="both"/>
-              <w:rPr>
-                <w:sz w:val="22"/>
-                <w:szCs w:val="22"/>
-                <w:lang w:val="en-GB"/>
-              </w:rPr>
-            </w:pPr>
-            <w:r>
-              <w:rPr>
-                <w:sz w:val="22"/>
-                <w:szCs w:val="22"/>
-                <w:lang w:val="en-GB"/>
-              </w:rPr>
-              <w:t>NOVEMBER</w:t>
+            <w:r>
+              <w:t>{{period_month_2}}</w:t>
             </w:r>
           </w:p>
         </w:tc>
@@ -4913,21 +4196,8 @@
             <w:vAlign w:val="bottom"/>
           </w:tcPr>
           <w:p>
-            <w:pPr>
-              <w:jc w:val="both"/>
-              <w:rPr>
-                <w:sz w:val="22"/>
-                <w:szCs w:val="22"/>
-                <w:lang w:val="en-GB"/>
-              </w:rPr>
-            </w:pPr>
-            <w:r>
-              <w:rPr>
-                <w:sz w:val="22"/>
-                <w:szCs w:val="22"/>
-                <w:lang w:val="en-GB"/>
-              </w:rPr>
-              <w:t>DECEMBER</w:t>
+            <w:r>
+              <w:t>{{period_month_3}}</w:t>
             </w:r>
           </w:p>
         </w:tc>

</xml_diff>